<commit_message>
Report and its build
</commit_message>
<xml_diff>
--- a/docs/plan.docx
+++ b/docs/plan.docx
@@ -555,6 +555,10 @@
     </w:p>
     <w:bookmarkEnd w:id="25"/>
     <w:sectPr/>
+    <w:sectPr>
+      <w:pgSz w:w="11906" w:h="16838"/>
+      <w:pgMar w:top="1134" w:right="1134" w:bottom="1134" w:left="1418" w:header="709" w:footer="709" w:gutter="0"/>
+    </w:sectPr>
   </w:body>
 </w:document>
 </file>

</xml_diff>

<commit_message>
Fixes from the subsystem review: merged part size and cost, DROP PARTITION, burst stream, lab bugs
</commit_message>
<xml_diff>
--- a/docs/plan.docx
+++ b/docs/plan.docx
@@ -36,7 +36,7 @@
         <w:t xml:space="preserve">MergeTree</w:t>
       </w:r>
       <w:r>
-        <w:t xml:space="preserve">. Кожна вставка створює на диску окремий кусок даних, а обмежений пул фонових потоків зливає дрібні куски у більші. Буфер не нескінченний: коли кількість активних кусків досягає</w:t>
+        <w:t xml:space="preserve">. Кожна вставка створює на диску окремий кусок даних, а обмежений пул фонових потоків зливає дрібні куски у більші. Буфер не нескінченний: коли кількість активних кусків в одній партиції досягає</w:t>
       </w:r>
       <w:r>
         <w:t xml:space="preserve"> </w:t>
@@ -180,7 +180,7 @@
         <w:pStyle w:val="FirstParagraph"/>
       </w:pPr>
       <w:r>
-        <w:t xml:space="preserve">Затримка вставок при переповненні черги робить модель замкненою: сповільнення обслуговування скорочує вхідний потік. У помірному режимі це стабілізує систему, але при дрібних вставках, коли на кожен вставлений байт припадає багато злиттів, вона переходить у режим постійного гальмування з відхиленням вставок. Модель має показати це кількісно, а не на рівні загальної поради.</w:t>
+        <w:t xml:space="preserve">Для клієнтів, які чекають завершення своєї вставки, затримка вставок при переповненні черги робить модель замкненою: сповільнення обслуговування скорочує вхідний потік. У помірному режимі це стабілізує систему, але при дрібних вставках, коли на кожен вставлений байт припадає багато злиттів, вона переходить у режим постійного гальмування з відхиленням вставок. Модель має показати це кількісно, а не на рівні загальної поради.</w:t>
       </w:r>
     </w:p>
     <w:bookmarkEnd w:id="22"/>
@@ -198,22 +198,7 @@
         <w:pStyle w:val="FirstParagraph"/>
       </w:pPr>
       <w:r>
-        <w:t xml:space="preserve">Змінюються розмір пулу фонових потоків, розмір пакета вставки при однаковому загальному темпі надходження даних та обмеження на максимальний обсяг злиття. Окремо розглядаються допоміжні структури, такі як проєкції та data skipping indices: вони перебудовуються при кожному злитті, тому кожна додана структура множить час обслуговування на (1 + δ), а саме δ береться з</w:t>
-      </w:r>
-      <w:r>
-        <w:t xml:space="preserve"> </w:t>
-      </w:r>
-      <w:r>
-        <w:rPr>
-          <w:rStyle w:val="VerbatimChar"/>
-        </w:rPr>
-        <w:t xml:space="preserve">projections_duration_ms</w:t>
-      </w:r>
-      <w:r>
-        <w:t xml:space="preserve"> </w:t>
-      </w:r>
-      <w:r>
-        <w:t xml:space="preserve">у тому ж журналі.</w:t>
+        <w:t xml:space="preserve">Змінюються розмір пулу фонових потоків, розмір пакета вставки при однаковому загальному темпі надходження даних та обмеження на максимальний обсяг злиття. Окремо розглядаються допоміжні структури, такі як проєкції та data skipping indices: вони перебудовуються при кожному злитті, тому кожна додана структура множить час обслуговування на (1 + δ), а δ береться з порівняння тривалості злиттів з цією структурою і без неї в тому ж журналі.</w:t>
       </w:r>
     </w:p>
     <w:p>
@@ -281,7 +266,7 @@
         <w:pStyle w:val="FirstParagraph"/>
       </w:pPr>
       <w:r>
-        <w:t xml:space="preserve">Кожна конфігурація проганяється кілька разів з відкиданням початкового перехідного періоду, результати подаються з довірчими інтервалами, а конфігурації порівнюються на однакових випадкових числах. Перевірка моделі виконується на граничних випадках (при дуже великому пулі черга кусків не повинна рости взагалі) і на живому сервері, куди подається той самий потік вставок, після чого виміряна кількість активних кусків і кількість затримок вставок порівнюються з модельними.</w:t>
+        <w:t xml:space="preserve">Кожна конфігурація проганяється кілька разів з відкиданням початкового перехідного періоду, результати подаються з довірчими інтервалами, а конфігурації порівнюються на однакових випадкових числах. Перевірка моделі виконується на граничних випадках (при дуже великому пулі кількість кусків визначається лише селектором і не доходить до порогу гальмування) і на живому сервері, куди подається той самий потік вставок, після чого виміряна кількість активних кусків і кількість затримок вставок порівнюються з модельними.</w:t>
       </w:r>
     </w:p>
     <w:bookmarkEnd w:id="23"/>

</xml_diff>